<commit_message>
last edit for this summer term. FINALLY
</commit_message>
<xml_diff>
--- a/receipt.docx
+++ b/receipt.docx
@@ -73,7 +73,7 @@
         <w:t xml:space="preserve">OR#: </w:t>
       </w:r>
       <w:r>
-        <w:t>POS20240710001</w:t>
+        <w:t>POS20240708014</w:t>
       </w:r>
     </w:p>
     <w:p>
@@ -84,7 +84,7 @@
         <w:t xml:space="preserve">DATE/TIME: </w:t>
       </w:r>
       <w:r>
-        <w:t>2024-07-10  10:10:05 am</w:t>
+        <w:t>2024-07-08  10:05:29 am</w:t>
       </w:r>
     </w:p>
     <w:p>
@@ -106,7 +106,7 @@
         <w:t xml:space="preserve">CUSTOMER NAME: </w:t>
       </w:r>
       <w:r>
-        <w:t>John</w:t>
+        <w:t>leah</w:t>
       </w:r>
     </w:p>
     <w:p>

</xml_diff>